<commit_message>
Add last doc generation
</commit_message>
<xml_diff>
--- a/backend/Protocol-visiting-template.docx
+++ b/backend/Protocol-visiting-template.docx
@@ -827,16 +827,16 @@
         <w:tblLook w:val="04A0" w:firstRow="1" w:lastRow="0" w:firstColumn="1" w:lastColumn="0" w:noHBand="0" w:noVBand="1"/>
       </w:tblPr>
       <w:tblGrid>
-        <w:gridCol w:w="258"/>
-        <w:gridCol w:w="336"/>
-        <w:gridCol w:w="494"/>
-        <w:gridCol w:w="494"/>
-        <w:gridCol w:w="493"/>
-        <w:gridCol w:w="493"/>
-        <w:gridCol w:w="493"/>
-        <w:gridCol w:w="493"/>
-        <w:gridCol w:w="493"/>
-        <w:gridCol w:w="493"/>
+        <w:gridCol w:w="270"/>
+        <w:gridCol w:w="334"/>
+        <w:gridCol w:w="492"/>
+        <w:gridCol w:w="492"/>
+        <w:gridCol w:w="492"/>
+        <w:gridCol w:w="492"/>
+        <w:gridCol w:w="492"/>
+        <w:gridCol w:w="492"/>
+        <w:gridCol w:w="492"/>
+        <w:gridCol w:w="492"/>
         <w:gridCol w:w="493"/>
         <w:gridCol w:w="493"/>
         <w:gridCol w:w="493"/>
@@ -1717,6 +1717,25 @@
                 <w:lang w:val="en-US"/>
               </w:rPr>
             </w:pPr>
+            <w:r>
+              <w:rPr>
+                <w:rFonts w:ascii="Times New Roman" w:hAnsi="Times New Roman"/>
+                <w:sz w:val="18"/>
+                <w:szCs w:val="18"/>
+                <w:lang w:val="en-US"/>
+              </w:rPr>
+              <w:t>{#empl</w:t>
+            </w:r>
+            <w:r>
+              <w:rPr>
+                <w:rFonts w:ascii="Times New Roman" w:hAnsi="Times New Roman"/>
+                <w:sz w:val="18"/>
+                <w:szCs w:val="18"/>
+                <w:lang w:val="en-US"/>
+              </w:rPr>
+              <w:lastRenderedPageBreak/>
+              <w:t>oyee}</w:t>
+            </w:r>
           </w:p>
         </w:tc>
         <w:tc>
@@ -1741,9 +1760,10 @@
                 <w:szCs w:val="18"/>
                 <w:lang w:val="en-US"/>
               </w:rPr>
-              <w:t>{#</w:t>
-            </w:r>
-            <w:proofErr w:type="gramStart"/>
+              <w:lastRenderedPageBreak/>
+              <w:t>{name} {</w:t>
+            </w:r>
+            <w:proofErr w:type="spellStart"/>
             <w:r>
               <w:rPr>
                 <w:rFonts w:ascii="Times New Roman" w:hAnsi="Times New Roman"/>
@@ -1751,9 +1771,8 @@
                 <w:szCs w:val="18"/>
                 <w:lang w:val="en-US"/>
               </w:rPr>
-              <w:t>employee}{</w:t>
-            </w:r>
-            <w:proofErr w:type="gramEnd"/>
+              <w:t>last_n</w:t>
+            </w:r>
             <w:r>
               <w:rPr>
                 <w:rFonts w:ascii="Times New Roman" w:hAnsi="Times New Roman"/>
@@ -1761,8 +1780,10 @@
                 <w:szCs w:val="18"/>
                 <w:lang w:val="en-US"/>
               </w:rPr>
-              <w:t>n</w:t>
-            </w:r>
+              <w:lastRenderedPageBreak/>
+              <w:t>ame</w:t>
+            </w:r>
+            <w:proofErr w:type="spellEnd"/>
             <w:r>
               <w:rPr>
                 <w:rFonts w:ascii="Times New Roman" w:hAnsi="Times New Roman"/>
@@ -1770,8 +1791,7 @@
                 <w:szCs w:val="18"/>
                 <w:lang w:val="en-US"/>
               </w:rPr>
-              <w:lastRenderedPageBreak/>
-              <w:t>ame} {</w:t>
+              <w:t>} {</w:t>
             </w:r>
             <w:proofErr w:type="spellStart"/>
             <w:r>
@@ -1781,9 +1801,9 @@
                 <w:szCs w:val="18"/>
                 <w:lang w:val="en-US"/>
               </w:rPr>
-              <w:t>last_name</w:t>
-            </w:r>
-            <w:proofErr w:type="spellEnd"/>
+              <w:t>middle_</w:t>
+            </w:r>
+            <w:proofErr w:type="gramStart"/>
             <w:r>
               <w:rPr>
                 <w:rFonts w:ascii="Times New Roman" w:hAnsi="Times New Roman"/>
@@ -1791,9 +1811,9 @@
                 <w:szCs w:val="18"/>
                 <w:lang w:val="en-US"/>
               </w:rPr>
-              <w:t>} {</w:t>
-            </w:r>
-            <w:proofErr w:type="spellStart"/>
+              <w:t>name</w:t>
+            </w:r>
+            <w:proofErr w:type="spellEnd"/>
             <w:r>
               <w:rPr>
                 <w:rFonts w:ascii="Times New Roman" w:hAnsi="Times New Roman"/>
@@ -1801,9 +1821,9 @@
                 <w:szCs w:val="18"/>
                 <w:lang w:val="en-US"/>
               </w:rPr>
-              <w:t>middle_name</w:t>
-            </w:r>
-            <w:proofErr w:type="spellEnd"/>
+              <w:t>}{</w:t>
+            </w:r>
+            <w:proofErr w:type="gramEnd"/>
             <w:r>
               <w:rPr>
                 <w:rFonts w:ascii="Times New Roman" w:hAnsi="Times New Roman"/>
@@ -1811,7 +1831,7 @@
                 <w:szCs w:val="18"/>
                 <w:lang w:val="en-US"/>
               </w:rPr>
-              <w:t>}{/employee}</w:t>
+              <w:t>/employee}</w:t>
             </w:r>
           </w:p>
         </w:tc>
@@ -4539,6 +4559,7 @@
     <w:lsdException w:name="HTML Sample" w:semiHidden="1" w:unhideWhenUsed="1"/>
     <w:lsdException w:name="HTML Typewriter" w:semiHidden="1" w:unhideWhenUsed="1"/>
     <w:lsdException w:name="HTML Variable" w:semiHidden="1" w:unhideWhenUsed="1"/>
+    <w:lsdException w:name="Normal Table" w:semiHidden="1" w:unhideWhenUsed="1"/>
     <w:lsdException w:name="annotation subject" w:semiHidden="1" w:unhideWhenUsed="1"/>
     <w:lsdException w:name="No List" w:semiHidden="1" w:unhideWhenUsed="1"/>
     <w:lsdException w:name="Outline List 1" w:semiHidden="1" w:unhideWhenUsed="1"/>
@@ -4581,8 +4602,11 @@
     <w:lsdException w:name="Table Contemporary" w:semiHidden="1" w:unhideWhenUsed="1"/>
     <w:lsdException w:name="Table Elegant" w:semiHidden="1" w:unhideWhenUsed="1"/>
     <w:lsdException w:name="Table Professional" w:semiHidden="1" w:unhideWhenUsed="1"/>
+    <w:lsdException w:name="Table Subtle 1" w:semiHidden="1" w:unhideWhenUsed="1"/>
     <w:lsdException w:name="Table Subtle 2" w:semiHidden="1" w:unhideWhenUsed="1"/>
     <w:lsdException w:name="Table Web 1" w:semiHidden="1" w:unhideWhenUsed="1"/>
+    <w:lsdException w:name="Table Web 2" w:semiHidden="1" w:unhideWhenUsed="1"/>
+    <w:lsdException w:name="Table Web 3" w:semiHidden="1" w:unhideWhenUsed="1"/>
     <w:lsdException w:name="Balloon Text" w:semiHidden="1" w:unhideWhenUsed="1"/>
     <w:lsdException w:name="Table Grid" w:uiPriority="39"/>
     <w:lsdException w:name="Table Theme" w:semiHidden="1" w:unhideWhenUsed="1"/>
@@ -4822,6 +4846,7 @@
   <w:style w:type="character" w:default="1" w:styleId="a1">
     <w:name w:val="Default Paragraph Font"/>
     <w:uiPriority w:val="1"/>
+    <w:semiHidden/>
     <w:unhideWhenUsed/>
   </w:style>
   <w:style w:type="table" w:default="1" w:styleId="a2">

</xml_diff>